<commit_message>
Update Godavari River Pollution Analysis Report.docx
</commit_message>
<xml_diff>
--- a/Godavari River Pollution Analysis Report.docx
+++ b/Godavari River Pollution Analysis Report.docx
@@ -4,6 +4,17 @@
   <w:body>
     <w:p>
       <w:r>
+        <w:t>Report</w:t>
+      </w:r>
+    </w:p>
+    <w:p>
+      <w:r>
+        <w:br w:type="page"/>
+      </w:r>
+    </w:p>
+    <w:p>
+      <w:r>
+        <w:lastRenderedPageBreak/>
         <w:t>Godavari River Pollution</w:t>
       </w:r>
       <w:r>
@@ -82,6 +93,18 @@
         </w:numPr>
       </w:pPr>
       <w:r>
+        <w:t>Water Quality Analysis</w:t>
+      </w:r>
+    </w:p>
+    <w:p>
+      <w:pPr>
+        <w:pStyle w:val="ListParagraph"/>
+        <w:numPr>
+          <w:ilvl w:val="1"/>
+          <w:numId w:val="1"/>
+        </w:numPr>
+      </w:pPr>
+      <w:r>
         <w:t>Wastewater &amp; Infrastructure</w:t>
       </w:r>
     </w:p>
@@ -95,164 +118,164 @@
       </w:pPr>
       <w:r>
         <w:t>Data &amp; Environmental Indicators</w:t>
-      </w:r>
-    </w:p>
-    <w:p>
-      <w:pPr>
-        <w:pStyle w:val="ListParagraph"/>
-        <w:numPr>
-          <w:ilvl w:val="1"/>
-          <w:numId w:val="1"/>
-        </w:numPr>
-      </w:pPr>
-      <w:r>
-        <w:t>Existing Interventions</w:t>
-      </w:r>
-    </w:p>
-    <w:p>
-      <w:pPr>
-        <w:pStyle w:val="ListParagraph"/>
-        <w:numPr>
-          <w:ilvl w:val="1"/>
-          <w:numId w:val="1"/>
-        </w:numPr>
-      </w:pPr>
-      <w:r>
-        <w:t>Recommendations</w:t>
-      </w:r>
-    </w:p>
-    <w:p>
-      <w:pPr>
-        <w:pStyle w:val="ListParagraph"/>
-        <w:numPr>
-          <w:ilvl w:val="1"/>
-          <w:numId w:val="1"/>
-        </w:numPr>
-      </w:pPr>
-      <w:r>
-        <w:t>Conclusion</w:t>
-      </w:r>
-    </w:p>
-    <w:p>
-      <w:pPr>
-        <w:pStyle w:val="ListParagraph"/>
-        <w:numPr>
-          <w:ilvl w:val="0"/>
-          <w:numId w:val="1"/>
-        </w:numPr>
-      </w:pPr>
-      <w:r>
-        <w:t>Dataset</w:t>
-      </w:r>
-    </w:p>
-    <w:p>
-      <w:pPr>
-        <w:pStyle w:val="ListParagraph"/>
-        <w:numPr>
-          <w:ilvl w:val="1"/>
-          <w:numId w:val="1"/>
-        </w:numPr>
-      </w:pPr>
-      <w:r>
-        <w:t>Pollution Sources</w:t>
-      </w:r>
-      <w:r>
-        <w:t xml:space="preserve"> – DONE.</w:t>
-      </w:r>
-    </w:p>
-    <w:p>
-      <w:pPr>
-        <w:pStyle w:val="ListParagraph"/>
-        <w:numPr>
-          <w:ilvl w:val="1"/>
-          <w:numId w:val="1"/>
-        </w:numPr>
-      </w:pPr>
-      <w:r>
-        <w:t>Water Quality Parameters</w:t>
-      </w:r>
-      <w:r>
-        <w:t xml:space="preserve"> – DONE.</w:t>
-      </w:r>
-    </w:p>
-    <w:p>
-      <w:pPr>
-        <w:pStyle w:val="ListParagraph"/>
-        <w:numPr>
-          <w:ilvl w:val="1"/>
-          <w:numId w:val="1"/>
-        </w:numPr>
-      </w:pPr>
-      <w:r>
-        <w:t>Interventions</w:t>
-      </w:r>
-      <w:r>
-        <w:t xml:space="preserve"> – DONE.</w:t>
-      </w:r>
-    </w:p>
-    <w:p>
-      <w:pPr>
-        <w:pStyle w:val="ListParagraph"/>
-        <w:numPr>
-          <w:ilvl w:val="0"/>
-          <w:numId w:val="1"/>
-        </w:numPr>
-      </w:pPr>
-      <w:r>
-        <w:t>Dashboard</w:t>
-      </w:r>
-      <w:r>
-        <w:t xml:space="preserve"> – DONE.</w:t>
-      </w:r>
-    </w:p>
-    <w:p>
-      <w:pPr>
-        <w:pStyle w:val="ListParagraph"/>
-        <w:numPr>
-          <w:ilvl w:val="0"/>
-          <w:numId w:val="1"/>
-        </w:numPr>
-      </w:pPr>
-      <w:proofErr w:type="spellStart"/>
-      <w:r>
-        <w:t>Github</w:t>
-      </w:r>
-      <w:proofErr w:type="spellEnd"/>
-    </w:p>
-    <w:p>
-      <w:pPr>
-        <w:pStyle w:val="ListParagraph"/>
-        <w:numPr>
-          <w:ilvl w:val="1"/>
-          <w:numId w:val="1"/>
-        </w:numPr>
-      </w:pPr>
-      <w:r>
-        <w:t>README.md</w:t>
-      </w:r>
-      <w:r>
-        <w:t xml:space="preserve"> – DONE.</w:t>
-      </w:r>
-    </w:p>
-    <w:p>
-      <w:pPr>
-        <w:pStyle w:val="ListParagraph"/>
-        <w:numPr>
-          <w:ilvl w:val="1"/>
-          <w:numId w:val="1"/>
-        </w:numPr>
-      </w:pPr>
-      <w:r>
-        <w:t>D</w:t>
-      </w:r>
-      <w:r>
-        <w:t>atasets</w:t>
-      </w:r>
-      <w:r>
-        <w:t xml:space="preserve"> – DONE.</w:t>
       </w:r>
       <w:bookmarkStart w:id="0" w:name="_GoBack"/>
       <w:bookmarkEnd w:id="0"/>
+    </w:p>
+    <w:p>
+      <w:pPr>
+        <w:pStyle w:val="ListParagraph"/>
+        <w:numPr>
+          <w:ilvl w:val="1"/>
+          <w:numId w:val="1"/>
+        </w:numPr>
+      </w:pPr>
+      <w:r>
+        <w:t>Existing Interventions</w:t>
+      </w:r>
+    </w:p>
+    <w:p>
+      <w:pPr>
+        <w:pStyle w:val="ListParagraph"/>
+        <w:numPr>
+          <w:ilvl w:val="1"/>
+          <w:numId w:val="1"/>
+        </w:numPr>
+      </w:pPr>
+      <w:r>
+        <w:t>Recommendations</w:t>
+      </w:r>
+    </w:p>
+    <w:p>
+      <w:pPr>
+        <w:pStyle w:val="ListParagraph"/>
+        <w:numPr>
+          <w:ilvl w:val="1"/>
+          <w:numId w:val="1"/>
+        </w:numPr>
+      </w:pPr>
+      <w:r>
+        <w:t>Conclusion</w:t>
+      </w:r>
+    </w:p>
+    <w:p>
+      <w:pPr>
+        <w:pStyle w:val="ListParagraph"/>
+        <w:numPr>
+          <w:ilvl w:val="0"/>
+          <w:numId w:val="1"/>
+        </w:numPr>
+      </w:pPr>
+      <w:r>
+        <w:t>Dataset</w:t>
+      </w:r>
+    </w:p>
+    <w:p>
+      <w:pPr>
+        <w:pStyle w:val="ListParagraph"/>
+        <w:numPr>
+          <w:ilvl w:val="1"/>
+          <w:numId w:val="1"/>
+        </w:numPr>
+      </w:pPr>
+      <w:r>
+        <w:t>Pollution Sources</w:t>
+      </w:r>
+      <w:r>
+        <w:t xml:space="preserve"> – DONE.</w:t>
+      </w:r>
+    </w:p>
+    <w:p>
+      <w:pPr>
+        <w:pStyle w:val="ListParagraph"/>
+        <w:numPr>
+          <w:ilvl w:val="1"/>
+          <w:numId w:val="1"/>
+        </w:numPr>
+      </w:pPr>
+      <w:r>
+        <w:t>Water Quality Parameters</w:t>
+      </w:r>
+      <w:r>
+        <w:t xml:space="preserve"> – DONE.</w:t>
+      </w:r>
+    </w:p>
+    <w:p>
+      <w:pPr>
+        <w:pStyle w:val="ListParagraph"/>
+        <w:numPr>
+          <w:ilvl w:val="1"/>
+          <w:numId w:val="1"/>
+        </w:numPr>
+      </w:pPr>
+      <w:r>
+        <w:t>Interventions</w:t>
+      </w:r>
+      <w:r>
+        <w:t xml:space="preserve"> – DONE.</w:t>
+      </w:r>
+    </w:p>
+    <w:p>
+      <w:pPr>
+        <w:pStyle w:val="ListParagraph"/>
+        <w:numPr>
+          <w:ilvl w:val="0"/>
+          <w:numId w:val="1"/>
+        </w:numPr>
+      </w:pPr>
+      <w:r>
+        <w:t>Dashboard</w:t>
+      </w:r>
+      <w:r>
+        <w:t xml:space="preserve"> – DONE.</w:t>
+      </w:r>
+    </w:p>
+    <w:p>
+      <w:pPr>
+        <w:pStyle w:val="ListParagraph"/>
+        <w:numPr>
+          <w:ilvl w:val="0"/>
+          <w:numId w:val="1"/>
+        </w:numPr>
+      </w:pPr>
+      <w:proofErr w:type="spellStart"/>
+      <w:r>
+        <w:t>Github</w:t>
+      </w:r>
+      <w:proofErr w:type="spellEnd"/>
+    </w:p>
+    <w:p>
+      <w:pPr>
+        <w:pStyle w:val="ListParagraph"/>
+        <w:numPr>
+          <w:ilvl w:val="1"/>
+          <w:numId w:val="1"/>
+        </w:numPr>
+      </w:pPr>
+      <w:r>
+        <w:t>README.md</w:t>
+      </w:r>
+      <w:r>
+        <w:t xml:space="preserve"> – DONE.</w:t>
+      </w:r>
+    </w:p>
+    <w:p>
+      <w:pPr>
+        <w:pStyle w:val="ListParagraph"/>
+        <w:numPr>
+          <w:ilvl w:val="1"/>
+          <w:numId w:val="1"/>
+        </w:numPr>
+      </w:pPr>
+      <w:r>
+        <w:t>D</w:t>
+      </w:r>
+      <w:r>
+        <w:t>atasets</w:t>
+      </w:r>
+      <w:r>
+        <w:t xml:space="preserve"> – DONE.</w:t>
+      </w:r>
     </w:p>
     <w:p>
       <w:pPr>

</xml_diff>